<commit_message>
Add Week 2 Note
</commit_message>
<xml_diff>
--- a/Modules/Week2/Note.docx
+++ b/Modules/Week2/Note.docx
@@ -32,6 +32,7 @@
     <w:p>
       <w:pPr>
         <w:numPr>
+          <w:ilvl w:val="0"/>
           <w:numId w:val="0"/>
         </w:numPr>
         <w:jc w:val="both"/>
@@ -75,6 +76,7 @@
     <w:p>
       <w:pPr>
         <w:numPr>
+          <w:ilvl w:val="0"/>
           <w:numId w:val="0"/>
         </w:numPr>
         <w:jc w:val="both"/>
@@ -82,6 +84,7 @@
           <w:rFonts w:hint="default" w:ascii="Times New Roman" w:hAnsi="Times New Roman" w:eastAsia="SimSun" w:cs="Times New Roman"/>
           <w:sz w:val="24"/>
           <w:szCs w:val="24"/>
+          <w:lang w:val="en-US"/>
         </w:rPr>
       </w:pPr>
       <w:r>
@@ -121,10 +124,20 @@
         </w:rPr>
         <w:t>If a requirement mandates "automatic allocation," but it later proves ineffective, the project faces costly changes.</w:t>
       </w:r>
-    </w:p>
-    <w:p>
-      <w:pPr>
-        <w:numPr>
+      <w:r>
+        <w:rPr>
+          <w:rFonts w:hint="default" w:ascii="Times New Roman" w:hAnsi="Times New Roman" w:eastAsia="SimSun" w:cs="Times New Roman"/>
+          <w:sz w:val="24"/>
+          <w:szCs w:val="24"/>
+          <w:lang w:val="en-US"/>
+        </w:rPr>
+        <w:t xml:space="preserve"> =&gt; critisism: make UI to early.</w:t>
+      </w:r>
+    </w:p>
+    <w:p>
+      <w:pPr>
+        <w:numPr>
+          <w:ilvl w:val="0"/>
           <w:numId w:val="0"/>
         </w:numPr>
         <w:jc w:val="both"/>
@@ -165,6 +178,7 @@
     <w:p>
       <w:pPr>
         <w:numPr>
+          <w:ilvl w:val="0"/>
           <w:numId w:val="0"/>
         </w:numPr>
         <w:jc w:val="both"/>
@@ -188,6 +202,7 @@
     <w:p>
       <w:pPr>
         <w:numPr>
+          <w:ilvl w:val="0"/>
           <w:numId w:val="0"/>
         </w:numPr>
         <w:jc w:val="both"/>
@@ -214,7 +229,633 @@
         </w:tblBorders>
         <w:tblLayout w:type="autofit"/>
         <w:tblCellMar>
+          <w:top w:w="0" w:type="dxa"/>
           <w:left w:w="108" w:type="dxa"/>
+          <w:bottom w:w="0" w:type="dxa"/>
+          <w:right w:w="108" w:type="dxa"/>
+        </w:tblCellMar>
+      </w:tblPr>
+      <w:tblGrid>
+        <w:gridCol w:w="2840"/>
+        <w:gridCol w:w="2841"/>
+        <w:gridCol w:w="2841"/>
+      </w:tblGrid>
+      <w:tr>
+        <w:tblPrEx>
+          <w:tblBorders>
+            <w:top w:val="single" w:color="auto" w:sz="4" w:space="0"/>
+            <w:left w:val="single" w:color="auto" w:sz="4" w:space="0"/>
+            <w:bottom w:val="single" w:color="auto" w:sz="4" w:space="0"/>
+            <w:right w:val="single" w:color="auto" w:sz="4" w:space="0"/>
+            <w:insideH w:val="single" w:color="auto" w:sz="4" w:space="0"/>
+            <w:insideV w:val="single" w:color="auto" w:sz="4" w:space="0"/>
+          </w:tblBorders>
+        </w:tblPrEx>
+        <w:tc>
+          <w:tcPr>
+            <w:tcW w:w="2840" w:type="dxa"/>
+          </w:tcPr>
+          <w:p>
+            <w:pPr>
+              <w:widowControl w:val="0"/>
+              <w:numPr>
+                <w:ilvl w:val="0"/>
+                <w:numId w:val="0"/>
+              </w:numPr>
+              <w:jc w:val="center"/>
+              <w:rPr>
+                <w:rFonts w:hint="default" w:ascii="Times New Roman" w:hAnsi="Times New Roman" w:eastAsia="SimSun" w:cs="Times New Roman"/>
+                <w:b/>
+                <w:bCs/>
+                <w:sz w:val="24"/>
+                <w:szCs w:val="24"/>
+                <w:vertAlign w:val="baseline"/>
+                <w:lang w:val="en-US"/>
+              </w:rPr>
+            </w:pPr>
+            <w:r>
+              <w:rPr>
+                <w:rFonts w:hint="default" w:ascii="Times New Roman" w:hAnsi="Times New Roman" w:eastAsia="SimSun" w:cs="Times New Roman"/>
+                <w:b/>
+                <w:bCs/>
+                <w:sz w:val="24"/>
+                <w:szCs w:val="24"/>
+                <w:vertAlign w:val="baseline"/>
+                <w:lang w:val="en-US"/>
+              </w:rPr>
+              <w:t>UML Use Case</w:t>
+            </w:r>
+          </w:p>
+        </w:tc>
+        <w:tc>
+          <w:tcPr>
+            <w:tcW w:w="2841" w:type="dxa"/>
+          </w:tcPr>
+          <w:p>
+            <w:pPr>
+              <w:widowControl w:val="0"/>
+              <w:numPr>
+                <w:ilvl w:val="0"/>
+                <w:numId w:val="0"/>
+              </w:numPr>
+              <w:jc w:val="center"/>
+              <w:rPr>
+                <w:rFonts w:hint="default" w:ascii="Times New Roman" w:hAnsi="Times New Roman" w:eastAsia="SimSun" w:cs="Times New Roman"/>
+                <w:b/>
+                <w:bCs/>
+                <w:sz w:val="24"/>
+                <w:szCs w:val="24"/>
+                <w:vertAlign w:val="baseline"/>
+                <w:lang w:val="en-US"/>
+              </w:rPr>
+            </w:pPr>
+            <w:r>
+              <w:rPr>
+                <w:rFonts w:hint="default" w:ascii="Times New Roman" w:hAnsi="Times New Roman" w:eastAsia="SimSun" w:cs="Times New Roman"/>
+                <w:b/>
+                <w:bCs/>
+                <w:sz w:val="24"/>
+                <w:szCs w:val="24"/>
+                <w:vertAlign w:val="baseline"/>
+                <w:lang w:val="en-US"/>
+              </w:rPr>
+              <w:t>Human/Computer Seperated</w:t>
+            </w:r>
+          </w:p>
+        </w:tc>
+        <w:tc>
+          <w:tcPr>
+            <w:tcW w:w="2841" w:type="dxa"/>
+          </w:tcPr>
+          <w:p>
+            <w:pPr>
+              <w:widowControl w:val="0"/>
+              <w:numPr>
+                <w:ilvl w:val="0"/>
+                <w:numId w:val="0"/>
+              </w:numPr>
+              <w:jc w:val="center"/>
+              <w:rPr>
+                <w:rFonts w:hint="default" w:ascii="Times New Roman" w:hAnsi="Times New Roman" w:eastAsia="SimSun" w:cs="Times New Roman"/>
+                <w:b/>
+                <w:bCs/>
+                <w:sz w:val="24"/>
+                <w:szCs w:val="24"/>
+                <w:vertAlign w:val="baseline"/>
+                <w:lang w:val="en-US"/>
+              </w:rPr>
+            </w:pPr>
+            <w:r>
+              <w:rPr>
+                <w:rFonts w:hint="default" w:ascii="Times New Roman" w:hAnsi="Times New Roman" w:eastAsia="SimSun" w:cs="Times New Roman"/>
+                <w:b/>
+                <w:bCs/>
+                <w:sz w:val="24"/>
+                <w:szCs w:val="24"/>
+                <w:vertAlign w:val="baseline"/>
+                <w:lang w:val="en-US"/>
+              </w:rPr>
+              <w:t>Task Description</w:t>
+            </w:r>
+          </w:p>
+        </w:tc>
+      </w:tr>
+      <w:tr>
+        <w:tblPrEx>
+          <w:tblBorders>
+            <w:top w:val="single" w:color="auto" w:sz="4" w:space="0"/>
+            <w:left w:val="single" w:color="auto" w:sz="4" w:space="0"/>
+            <w:bottom w:val="single" w:color="auto" w:sz="4" w:space="0"/>
+            <w:right w:val="single" w:color="auto" w:sz="4" w:space="0"/>
+            <w:insideH w:val="single" w:color="auto" w:sz="4" w:space="0"/>
+            <w:insideV w:val="single" w:color="auto" w:sz="4" w:space="0"/>
+          </w:tblBorders>
+          <w:tblCellMar>
+            <w:top w:w="0" w:type="dxa"/>
+            <w:left w:w="108" w:type="dxa"/>
+            <w:bottom w:w="0" w:type="dxa"/>
+            <w:right w:w="108" w:type="dxa"/>
+          </w:tblCellMar>
+        </w:tblPrEx>
+        <w:tc>
+          <w:tcPr>
+            <w:tcW w:w="2840" w:type="dxa"/>
+          </w:tcPr>
+          <w:p>
+            <w:pPr>
+              <w:widowControl w:val="0"/>
+              <w:numPr>
+                <w:ilvl w:val="0"/>
+                <w:numId w:val="0"/>
+              </w:numPr>
+              <w:jc w:val="both"/>
+              <w:rPr>
+                <w:rFonts w:hint="default" w:ascii="Times New Roman" w:hAnsi="Times New Roman" w:eastAsia="SimSun" w:cs="Times New Roman"/>
+                <w:b w:val="0"/>
+                <w:bCs w:val="0"/>
+                <w:sz w:val="24"/>
+                <w:szCs w:val="24"/>
+                <w:vertAlign w:val="baseline"/>
+                <w:lang w:val="en-US"/>
+              </w:rPr>
+            </w:pPr>
+            <w:r>
+              <w:rPr>
+                <w:rFonts w:hint="default" w:ascii="Times New Roman" w:hAnsi="Times New Roman" w:eastAsia="SimSun" w:cs="Times New Roman"/>
+                <w:b w:val="0"/>
+                <w:bCs w:val="0"/>
+                <w:sz w:val="24"/>
+                <w:szCs w:val="24"/>
+              </w:rPr>
+              <w:t>Shows use cases as bubbles strictly inside the system.</w:t>
+            </w:r>
+          </w:p>
+        </w:tc>
+        <w:tc>
+          <w:tcPr>
+            <w:tcW w:w="2841" w:type="dxa"/>
+          </w:tcPr>
+          <w:p>
+            <w:pPr>
+              <w:widowControl w:val="0"/>
+              <w:numPr>
+                <w:ilvl w:val="0"/>
+                <w:numId w:val="0"/>
+              </w:numPr>
+              <w:jc w:val="both"/>
+              <w:rPr>
+                <w:rFonts w:hint="default" w:ascii="Times New Roman" w:hAnsi="Times New Roman" w:eastAsia="SimSun" w:cs="Times New Roman"/>
+                <w:b w:val="0"/>
+                <w:bCs w:val="0"/>
+                <w:sz w:val="24"/>
+                <w:szCs w:val="24"/>
+                <w:vertAlign w:val="baseline"/>
+                <w:lang w:val="en-US"/>
+              </w:rPr>
+            </w:pPr>
+            <w:r>
+              <w:rPr>
+                <w:rFonts w:hint="default" w:ascii="Times New Roman" w:hAnsi="Times New Roman" w:eastAsia="SimSun" w:cs="Times New Roman"/>
+                <w:b w:val="0"/>
+                <w:bCs w:val="0"/>
+                <w:sz w:val="24"/>
+                <w:szCs w:val="24"/>
+              </w:rPr>
+              <w:t>Distinguishes between user actions and system actions immediately.</w:t>
+            </w:r>
+          </w:p>
+        </w:tc>
+        <w:tc>
+          <w:tcPr>
+            <w:tcW w:w="2841" w:type="dxa"/>
+          </w:tcPr>
+          <w:p>
+            <w:pPr>
+              <w:widowControl w:val="0"/>
+              <w:numPr>
+                <w:ilvl w:val="0"/>
+                <w:numId w:val="0"/>
+              </w:numPr>
+              <w:jc w:val="both"/>
+              <w:rPr>
+                <w:rFonts w:hint="default" w:ascii="Times New Roman" w:hAnsi="Times New Roman" w:eastAsia="SimSun" w:cs="Times New Roman"/>
+                <w:b w:val="0"/>
+                <w:bCs w:val="0"/>
+                <w:sz w:val="24"/>
+                <w:szCs w:val="24"/>
+                <w:vertAlign w:val="baseline"/>
+                <w:lang w:val="en-US"/>
+              </w:rPr>
+            </w:pPr>
+            <w:r>
+              <w:rPr>
+                <w:rFonts w:hint="default" w:ascii="Times New Roman" w:hAnsi="Times New Roman" w:eastAsia="SimSun" w:cs="Times New Roman"/>
+                <w:b w:val="0"/>
+                <w:bCs w:val="0"/>
+                <w:sz w:val="24"/>
+                <w:szCs w:val="24"/>
+              </w:rPr>
+              <w:t>The bubble represents the entire task shared by both actors.</w:t>
+            </w:r>
+          </w:p>
+        </w:tc>
+      </w:tr>
+      <w:tr>
+        <w:tblPrEx>
+          <w:tblBorders>
+            <w:top w:val="single" w:color="auto" w:sz="4" w:space="0"/>
+            <w:left w:val="single" w:color="auto" w:sz="4" w:space="0"/>
+            <w:bottom w:val="single" w:color="auto" w:sz="4" w:space="0"/>
+            <w:right w:val="single" w:color="auto" w:sz="4" w:space="0"/>
+            <w:insideH w:val="single" w:color="auto" w:sz="4" w:space="0"/>
+            <w:insideV w:val="single" w:color="auto" w:sz="4" w:space="0"/>
+          </w:tblBorders>
+          <w:tblCellMar>
+            <w:top w:w="0" w:type="dxa"/>
+            <w:left w:w="108" w:type="dxa"/>
+            <w:bottom w:w="0" w:type="dxa"/>
+            <w:right w:w="108" w:type="dxa"/>
+          </w:tblCellMar>
+        </w:tblPrEx>
+        <w:tc>
+          <w:tcPr>
+            <w:tcW w:w="2840" w:type="dxa"/>
+          </w:tcPr>
+          <w:p>
+            <w:pPr>
+              <w:widowControl w:val="0"/>
+              <w:numPr>
+                <w:ilvl w:val="0"/>
+                <w:numId w:val="0"/>
+              </w:numPr>
+              <w:jc w:val="both"/>
+              <w:rPr>
+                <w:rFonts w:hint="default" w:ascii="Times New Roman" w:hAnsi="Times New Roman" w:eastAsia="SimSun" w:cs="Times New Roman"/>
+                <w:b w:val="0"/>
+                <w:bCs w:val="0"/>
+                <w:sz w:val="24"/>
+                <w:szCs w:val="24"/>
+                <w:vertAlign w:val="baseline"/>
+                <w:lang w:val="en-US"/>
+              </w:rPr>
+            </w:pPr>
+            <w:r>
+              <w:rPr>
+                <w:rFonts w:hint="default" w:ascii="Times New Roman" w:hAnsi="Times New Roman" w:eastAsia="SimSun" w:cs="Times New Roman"/>
+                <w:b w:val="0"/>
+                <w:bCs w:val="0"/>
+                <w:sz w:val="24"/>
+                <w:szCs w:val="24"/>
+              </w:rPr>
+              <w:t>Focuses only on what the computer performs.</w:t>
+            </w:r>
+          </w:p>
+        </w:tc>
+        <w:tc>
+          <w:tcPr>
+            <w:tcW w:w="2841" w:type="dxa"/>
+          </w:tcPr>
+          <w:p>
+            <w:pPr>
+              <w:widowControl w:val="0"/>
+              <w:numPr>
+                <w:ilvl w:val="0"/>
+                <w:numId w:val="0"/>
+              </w:numPr>
+              <w:jc w:val="both"/>
+              <w:rPr>
+                <w:rFonts w:hint="default" w:ascii="Times New Roman" w:hAnsi="Times New Roman" w:eastAsia="SimSun" w:cs="Times New Roman"/>
+                <w:b w:val="0"/>
+                <w:bCs w:val="0"/>
+                <w:sz w:val="24"/>
+                <w:szCs w:val="24"/>
+                <w:vertAlign w:val="baseline"/>
+                <w:lang w:val="en-US"/>
+              </w:rPr>
+            </w:pPr>
+            <w:r>
+              <w:rPr>
+                <w:rFonts w:hint="default" w:ascii="Times New Roman" w:hAnsi="Times New Roman" w:eastAsia="SimSun" w:cs="Times New Roman"/>
+                <w:b w:val="0"/>
+                <w:bCs w:val="0"/>
+                <w:sz w:val="24"/>
+                <w:szCs w:val="24"/>
+              </w:rPr>
+              <w:t>Forces a division of labor during the requirements phase.</w:t>
+            </w:r>
+          </w:p>
+        </w:tc>
+        <w:tc>
+          <w:tcPr>
+            <w:tcW w:w="2841" w:type="dxa"/>
+          </w:tcPr>
+          <w:p>
+            <w:pPr>
+              <w:widowControl w:val="0"/>
+              <w:numPr>
+                <w:ilvl w:val="0"/>
+                <w:numId w:val="0"/>
+              </w:numPr>
+              <w:jc w:val="both"/>
+              <w:rPr>
+                <w:rFonts w:hint="default" w:ascii="Times New Roman" w:hAnsi="Times New Roman" w:eastAsia="SimSun" w:cs="Times New Roman"/>
+                <w:b w:val="0"/>
+                <w:bCs w:val="0"/>
+                <w:sz w:val="24"/>
+                <w:szCs w:val="24"/>
+                <w:vertAlign w:val="baseline"/>
+                <w:lang w:val="en-US"/>
+              </w:rPr>
+            </w:pPr>
+            <w:r>
+              <w:rPr>
+                <w:rFonts w:hint="default" w:ascii="Times New Roman" w:hAnsi="Times New Roman" w:eastAsia="SimSun" w:cs="Times New Roman"/>
+                <w:b w:val="0"/>
+                <w:bCs w:val="0"/>
+                <w:sz w:val="24"/>
+                <w:szCs w:val="24"/>
+              </w:rPr>
+              <w:t>Postpones the split; human and computer carry out the task together.</w:t>
+            </w:r>
+          </w:p>
+        </w:tc>
+      </w:tr>
+    </w:tbl>
+    <w:p>
+      <w:pPr>
+        <w:numPr>
+          <w:ilvl w:val="0"/>
+          <w:numId w:val="0"/>
+        </w:numPr>
+        <w:jc w:val="both"/>
+        <w:rPr>
+          <w:rFonts w:hint="default" w:ascii="Times New Roman" w:hAnsi="Times New Roman" w:eastAsia="SimSun" w:cs="Times New Roman"/>
+          <w:sz w:val="24"/>
+          <w:szCs w:val="24"/>
+          <w:lang w:val="en-US"/>
+        </w:rPr>
+      </w:pPr>
+    </w:p>
+    <w:p>
+      <w:pPr>
+        <w:numPr>
+          <w:ilvl w:val="0"/>
+          <w:numId w:val="0"/>
+        </w:numPr>
+        <w:jc w:val="both"/>
+        <w:rPr>
+          <w:rFonts w:hint="default" w:ascii="Times New Roman" w:hAnsi="Times New Roman" w:eastAsia="SimSun" w:cs="Times New Roman"/>
+          <w:b w:val="0"/>
+          <w:bCs w:val="0"/>
+          <w:sz w:val="24"/>
+          <w:szCs w:val="24"/>
+          <w:lang w:val="en-US"/>
+        </w:rPr>
+      </w:pPr>
+      <w:r>
+        <w:rPr>
+          <w:rFonts w:hint="default" w:ascii="Times New Roman" w:hAnsi="Times New Roman" w:eastAsia="SimSun" w:cs="Times New Roman"/>
+          <w:sz w:val="24"/>
+          <w:szCs w:val="24"/>
+          <w:lang w:val="en-US"/>
+        </w:rPr>
+        <w:t xml:space="preserve">- Structure of Task Description: </w:t>
+      </w:r>
+      <w:r>
+        <w:rPr>
+          <w:rFonts w:hint="default" w:ascii="Times New Roman" w:hAnsi="Times New Roman" w:eastAsia="SimSun" w:cs="Times New Roman"/>
+          <w:sz w:val="24"/>
+          <w:szCs w:val="24"/>
+        </w:rPr>
+        <w:t xml:space="preserve">A high-quality task description includes several key </w:t>
+      </w:r>
+      <w:r>
+        <w:rPr>
+          <w:rFonts w:hint="default" w:ascii="Times New Roman" w:hAnsi="Times New Roman" w:eastAsia="SimSun" w:cs="Times New Roman"/>
+          <w:b w:val="0"/>
+          <w:bCs w:val="0"/>
+          <w:sz w:val="24"/>
+          <w:szCs w:val="24"/>
+        </w:rPr>
+        <w:t>components:</w:t>
+      </w:r>
+    </w:p>
+    <w:p>
+      <w:pPr>
+        <w:pStyle w:val="4"/>
+        <w:keepNext w:val="0"/>
+        <w:keepLines w:val="0"/>
+        <w:widowControl/>
+        <w:suppressLineNumbers w:val="0"/>
+        <w:spacing w:before="0" w:beforeAutospacing="0" w:line="14" w:lineRule="atLeast"/>
+        <w:rPr>
+          <w:rFonts w:hint="default" w:ascii="Times New Roman" w:hAnsi="Times New Roman" w:eastAsia="sans-serif" w:cs="Times New Roman"/>
+          <w:b w:val="0"/>
+          <w:bCs w:val="0"/>
+        </w:rPr>
+      </w:pPr>
+      <w:r>
+        <w:rPr>
+          <w:rFonts w:hint="default" w:ascii="Times New Roman" w:hAnsi="Times New Roman" w:eastAsia="SimSun" w:cs="Times New Roman"/>
+          <w:b w:val="0"/>
+          <w:bCs w:val="0"/>
+          <w:sz w:val="24"/>
+          <w:szCs w:val="24"/>
+          <w:lang w:val="en-US"/>
+        </w:rPr>
+        <w:t xml:space="preserve">    + </w:t>
+      </w:r>
+      <w:r>
+        <w:rPr>
+          <w:rFonts w:hint="default" w:ascii="Times New Roman" w:hAnsi="Times New Roman" w:eastAsia="sans-serif" w:cs="Times New Roman"/>
+          <w:b w:val="0"/>
+          <w:bCs w:val="0"/>
+        </w:rPr>
+        <w:t xml:space="preserve">Purpose: The goal or state change desired, such as "Give guest a room". </w:t>
+      </w:r>
+    </w:p>
+    <w:p>
+      <w:pPr>
+        <w:pStyle w:val="4"/>
+        <w:keepNext w:val="0"/>
+        <w:keepLines w:val="0"/>
+        <w:widowControl/>
+        <w:suppressLineNumbers w:val="0"/>
+        <w:spacing w:before="0" w:beforeAutospacing="0" w:line="14" w:lineRule="atLeast"/>
+        <w:ind w:firstLine="240" w:firstLineChars="100"/>
+        <w:rPr>
+          <w:rFonts w:hint="default" w:ascii="Times New Roman" w:hAnsi="Times New Roman" w:eastAsia="sans-serif" w:cs="Times New Roman"/>
+          <w:b w:val="0"/>
+          <w:bCs w:val="0"/>
+        </w:rPr>
+      </w:pPr>
+      <w:r>
+        <w:rPr>
+          <w:rFonts w:hint="default" w:ascii="Times New Roman" w:hAnsi="Times New Roman" w:eastAsia="sans-serif" w:cs="Times New Roman"/>
+          <w:b w:val="0"/>
+          <w:bCs w:val="0"/>
+          <w:lang w:val="en-US"/>
+        </w:rPr>
+        <w:t xml:space="preserve">+ </w:t>
+      </w:r>
+      <w:r>
+        <w:rPr>
+          <w:rFonts w:hint="default" w:ascii="Times New Roman" w:hAnsi="Times New Roman" w:eastAsia="sans-serif" w:cs="Times New Roman"/>
+          <w:b w:val="0"/>
+          <w:bCs w:val="0"/>
+        </w:rPr>
+        <w:t xml:space="preserve">Trigger: The event that initiates the task, like "A guest arrives". </w:t>
+      </w:r>
+    </w:p>
+    <w:p>
+      <w:pPr>
+        <w:pStyle w:val="4"/>
+        <w:keepNext w:val="0"/>
+        <w:keepLines w:val="0"/>
+        <w:widowControl/>
+        <w:suppressLineNumbers w:val="0"/>
+        <w:spacing w:before="0" w:beforeAutospacing="0" w:line="14" w:lineRule="atLeast"/>
+        <w:ind w:firstLine="240" w:firstLineChars="100"/>
+        <w:rPr>
+          <w:rFonts w:hint="default" w:ascii="Times New Roman" w:hAnsi="Times New Roman" w:eastAsia="sans-serif" w:cs="Times New Roman"/>
+          <w:b w:val="0"/>
+          <w:bCs w:val="0"/>
+        </w:rPr>
+      </w:pPr>
+      <w:r>
+        <w:rPr>
+          <w:rFonts w:hint="default" w:ascii="Times New Roman" w:hAnsi="Times New Roman" w:eastAsia="sans-serif" w:cs="Times New Roman"/>
+          <w:b w:val="0"/>
+          <w:bCs w:val="0"/>
+          <w:lang w:val="en-US"/>
+        </w:rPr>
+        <w:t xml:space="preserve">+ </w:t>
+      </w:r>
+      <w:r>
+        <w:rPr>
+          <w:rFonts w:hint="default" w:ascii="Times New Roman" w:hAnsi="Times New Roman" w:eastAsia="sans-serif" w:cs="Times New Roman"/>
+          <w:b w:val="0"/>
+          <w:bCs w:val="0"/>
+        </w:rPr>
+        <w:t xml:space="preserve">Subtasks: Steps required to complete the goal, written in imperative language (e.g., "Find room"). </w:t>
+      </w:r>
+    </w:p>
+    <w:p>
+      <w:pPr>
+        <w:pStyle w:val="4"/>
+        <w:keepNext w:val="0"/>
+        <w:keepLines w:val="0"/>
+        <w:widowControl/>
+        <w:suppressLineNumbers w:val="0"/>
+        <w:spacing w:before="0" w:beforeAutospacing="0" w:line="14" w:lineRule="atLeast"/>
+        <w:ind w:firstLine="240" w:firstLineChars="100"/>
+        <w:rPr>
+          <w:rFonts w:hint="default" w:ascii="Times New Roman" w:hAnsi="Times New Roman" w:eastAsia="sans-serif" w:cs="Times New Roman"/>
+          <w:b w:val="0"/>
+          <w:bCs w:val="0"/>
+        </w:rPr>
+      </w:pPr>
+      <w:r>
+        <w:rPr>
+          <w:rFonts w:hint="default" w:ascii="Times New Roman" w:hAnsi="Times New Roman" w:eastAsia="sans-serif" w:cs="Times New Roman"/>
+          <w:b w:val="0"/>
+          <w:bCs w:val="0"/>
+          <w:lang w:val="en-US"/>
+        </w:rPr>
+        <w:t xml:space="preserve">+ </w:t>
+      </w:r>
+      <w:r>
+        <w:rPr>
+          <w:rFonts w:hint="default" w:ascii="Times New Roman" w:hAnsi="Times New Roman" w:eastAsia="sans-serif" w:cs="Times New Roman"/>
+          <w:b w:val="0"/>
+          <w:bCs w:val="0"/>
+        </w:rPr>
+        <w:t xml:space="preserve">Variants: Special cases or exceptions, such as "No suitable room" or "Regular customer". </w:t>
+      </w:r>
+    </w:p>
+    <w:p>
+      <w:pPr>
+        <w:numPr>
+          <w:ilvl w:val="0"/>
+          <w:numId w:val="0"/>
+        </w:numPr>
+        <w:jc w:val="both"/>
+        <w:rPr>
+          <w:rFonts w:hint="default" w:ascii="Times New Roman" w:hAnsi="Times New Roman" w:eastAsia="SimSun" w:cs="Times New Roman"/>
+          <w:sz w:val="24"/>
+          <w:szCs w:val="24"/>
+        </w:rPr>
+      </w:pPr>
+      <w:r>
+        <w:rPr>
+          <w:rFonts w:hint="default" w:ascii="Times New Roman" w:hAnsi="Times New Roman" w:eastAsia="SimSun" w:cs="Times New Roman"/>
+          <w:sz w:val="24"/>
+          <w:szCs w:val="24"/>
+          <w:lang w:val="en-US"/>
+        </w:rPr>
+        <w:t xml:space="preserve">- The Task and Support Table: </w:t>
+      </w:r>
+      <w:r>
+        <w:rPr>
+          <w:rFonts w:hint="default" w:ascii="Times New Roman" w:hAnsi="Times New Roman" w:eastAsia="SimSun" w:cs="Times New Roman"/>
+          <w:sz w:val="24"/>
+          <w:szCs w:val="24"/>
+        </w:rPr>
+        <w:t>This format links domain-level activities directly to potential technical solutions:</w:t>
+      </w:r>
+    </w:p>
+    <w:p>
+      <w:pPr>
+        <w:numPr>
+          <w:ilvl w:val="0"/>
+          <w:numId w:val="0"/>
+        </w:numPr>
+        <w:jc w:val="both"/>
+        <w:rPr>
+          <w:rFonts w:hint="default" w:ascii="Times New Roman" w:hAnsi="Times New Roman" w:eastAsia="SimSun" w:cs="Times New Roman"/>
+          <w:sz w:val="24"/>
+          <w:szCs w:val="24"/>
+        </w:rPr>
+      </w:pPr>
+    </w:p>
+    <w:tbl>
+      <w:tblPr>
+        <w:tblStyle w:val="5"/>
+        <w:tblW w:w="0" w:type="auto"/>
+        <w:tblInd w:w="0" w:type="dxa"/>
+        <w:tblBorders>
+          <w:top w:val="single" w:color="auto" w:sz="4" w:space="0"/>
+          <w:left w:val="single" w:color="auto" w:sz="4" w:space="0"/>
+          <w:bottom w:val="single" w:color="auto" w:sz="4" w:space="0"/>
+          <w:right w:val="single" w:color="auto" w:sz="4" w:space="0"/>
+          <w:insideH w:val="single" w:color="auto" w:sz="4" w:space="0"/>
+          <w:insideV w:val="single" w:color="auto" w:sz="4" w:space="0"/>
+        </w:tblBorders>
+        <w:tblLayout w:type="autofit"/>
+        <w:tblCellMar>
+          <w:top w:w="0" w:type="dxa"/>
+          <w:left w:w="108" w:type="dxa"/>
+          <w:bottom w:w="0" w:type="dxa"/>
           <w:right w:w="108" w:type="dxa"/>
         </w:tblCellMar>
       </w:tblPr>
@@ -234,7 +875,9 @@
             <w:insideV w:val="single" w:color="auto" w:sz="4" w:space="0"/>
           </w:tblBorders>
           <w:tblCellMar>
+            <w:top w:w="0" w:type="dxa"/>
             <w:left w:w="108" w:type="dxa"/>
+            <w:bottom w:w="0" w:type="dxa"/>
             <w:right w:w="108" w:type="dxa"/>
           </w:tblCellMar>
         </w:tblPrEx>
@@ -244,607 +887,9 @@
           </w:tcPr>
           <w:p>
             <w:pPr>
+              <w:widowControl w:val="0"/>
               <w:numPr>
-                <w:numId w:val="0"/>
-              </w:numPr>
-              <w:jc w:val="center"/>
-              <w:rPr>
-                <w:rFonts w:hint="default" w:ascii="Times New Roman" w:hAnsi="Times New Roman" w:eastAsia="SimSun" w:cs="Times New Roman"/>
-                <w:b/>
-                <w:bCs/>
-                <w:sz w:val="24"/>
-                <w:szCs w:val="24"/>
-                <w:vertAlign w:val="baseline"/>
-                <w:lang w:val="en-US"/>
-              </w:rPr>
-            </w:pPr>
-            <w:r>
-              <w:rPr>
-                <w:rFonts w:hint="default" w:ascii="Times New Roman" w:hAnsi="Times New Roman" w:eastAsia="SimSun" w:cs="Times New Roman"/>
-                <w:b/>
-                <w:bCs/>
-                <w:sz w:val="24"/>
-                <w:szCs w:val="24"/>
-                <w:vertAlign w:val="baseline"/>
-                <w:lang w:val="en-US"/>
-              </w:rPr>
-              <w:t>UML Use Case</w:t>
-            </w:r>
-          </w:p>
-        </w:tc>
-        <w:tc>
-          <w:tcPr>
-            <w:tcW w:w="2841" w:type="dxa"/>
-          </w:tcPr>
-          <w:p>
-            <w:pPr>
-              <w:numPr>
-                <w:numId w:val="0"/>
-              </w:numPr>
-              <w:jc w:val="center"/>
-              <w:rPr>
-                <w:rFonts w:hint="default" w:ascii="Times New Roman" w:hAnsi="Times New Roman" w:eastAsia="SimSun" w:cs="Times New Roman"/>
-                <w:b/>
-                <w:bCs/>
-                <w:sz w:val="24"/>
-                <w:szCs w:val="24"/>
-                <w:vertAlign w:val="baseline"/>
-                <w:lang w:val="en-US"/>
-              </w:rPr>
-            </w:pPr>
-            <w:r>
-              <w:rPr>
-                <w:rFonts w:hint="default" w:ascii="Times New Roman" w:hAnsi="Times New Roman" w:eastAsia="SimSun" w:cs="Times New Roman"/>
-                <w:b/>
-                <w:bCs/>
-                <w:sz w:val="24"/>
-                <w:szCs w:val="24"/>
-                <w:vertAlign w:val="baseline"/>
-                <w:lang w:val="en-US"/>
-              </w:rPr>
-              <w:t>Human/Computer Seperated</w:t>
-            </w:r>
-          </w:p>
-        </w:tc>
-        <w:tc>
-          <w:tcPr>
-            <w:tcW w:w="2841" w:type="dxa"/>
-          </w:tcPr>
-          <w:p>
-            <w:pPr>
-              <w:numPr>
-                <w:numId w:val="0"/>
-              </w:numPr>
-              <w:jc w:val="center"/>
-              <w:rPr>
-                <w:rFonts w:hint="default" w:ascii="Times New Roman" w:hAnsi="Times New Roman" w:eastAsia="SimSun" w:cs="Times New Roman"/>
-                <w:b/>
-                <w:bCs/>
-                <w:sz w:val="24"/>
-                <w:szCs w:val="24"/>
-                <w:vertAlign w:val="baseline"/>
-                <w:lang w:val="en-US"/>
-              </w:rPr>
-            </w:pPr>
-            <w:r>
-              <w:rPr>
-                <w:rFonts w:hint="default" w:ascii="Times New Roman" w:hAnsi="Times New Roman" w:eastAsia="SimSun" w:cs="Times New Roman"/>
-                <w:b/>
-                <w:bCs/>
-                <w:sz w:val="24"/>
-                <w:szCs w:val="24"/>
-                <w:vertAlign w:val="baseline"/>
-                <w:lang w:val="en-US"/>
-              </w:rPr>
-              <w:t>Task Description</w:t>
-            </w:r>
-          </w:p>
-        </w:tc>
-      </w:tr>
-      <w:tr>
-        <w:tblPrEx>
-          <w:tblBorders>
-            <w:top w:val="single" w:color="auto" w:sz="4" w:space="0"/>
-            <w:left w:val="single" w:color="auto" w:sz="4" w:space="0"/>
-            <w:bottom w:val="single" w:color="auto" w:sz="4" w:space="0"/>
-            <w:right w:val="single" w:color="auto" w:sz="4" w:space="0"/>
-            <w:insideH w:val="single" w:color="auto" w:sz="4" w:space="0"/>
-            <w:insideV w:val="single" w:color="auto" w:sz="4" w:space="0"/>
-          </w:tblBorders>
-          <w:tblCellMar>
-            <w:left w:w="108" w:type="dxa"/>
-            <w:right w:w="108" w:type="dxa"/>
-          </w:tblCellMar>
-        </w:tblPrEx>
-        <w:tc>
-          <w:tcPr>
-            <w:tcW w:w="2840" w:type="dxa"/>
-          </w:tcPr>
-          <w:p>
-            <w:pPr>
-              <w:numPr>
-                <w:numId w:val="0"/>
-              </w:numPr>
-              <w:jc w:val="both"/>
-              <w:rPr>
-                <w:rFonts w:hint="default" w:ascii="Times New Roman" w:hAnsi="Times New Roman" w:eastAsia="SimSun" w:cs="Times New Roman"/>
-                <w:b w:val="0"/>
-                <w:bCs w:val="0"/>
-                <w:sz w:val="24"/>
-                <w:szCs w:val="24"/>
-                <w:vertAlign w:val="baseline"/>
-                <w:lang w:val="en-US"/>
-              </w:rPr>
-            </w:pPr>
-            <w:r>
-              <w:rPr>
-                <w:rFonts w:hint="default" w:ascii="Times New Roman" w:hAnsi="Times New Roman" w:eastAsia="SimSun" w:cs="Times New Roman"/>
-                <w:b w:val="0"/>
-                <w:bCs w:val="0"/>
-                <w:sz w:val="24"/>
-                <w:szCs w:val="24"/>
-              </w:rPr>
-              <w:t>Shows use cases as bubbles strictly inside the system.</w:t>
-            </w:r>
-          </w:p>
-        </w:tc>
-        <w:tc>
-          <w:tcPr>
-            <w:tcW w:w="2841" w:type="dxa"/>
-          </w:tcPr>
-          <w:p>
-            <w:pPr>
-              <w:numPr>
-                <w:numId w:val="0"/>
-              </w:numPr>
-              <w:jc w:val="both"/>
-              <w:rPr>
-                <w:rFonts w:hint="default" w:ascii="Times New Roman" w:hAnsi="Times New Roman" w:eastAsia="SimSun" w:cs="Times New Roman"/>
-                <w:b w:val="0"/>
-                <w:bCs w:val="0"/>
-                <w:sz w:val="24"/>
-                <w:szCs w:val="24"/>
-                <w:vertAlign w:val="baseline"/>
-                <w:lang w:val="en-US"/>
-              </w:rPr>
-            </w:pPr>
-            <w:r>
-              <w:rPr>
-                <w:rFonts w:hint="default" w:ascii="Times New Roman" w:hAnsi="Times New Roman" w:eastAsia="SimSun" w:cs="Times New Roman"/>
-                <w:b w:val="0"/>
-                <w:bCs w:val="0"/>
-                <w:sz w:val="24"/>
-                <w:szCs w:val="24"/>
-              </w:rPr>
-              <w:t>Distinguishes between user actions and system actions immediately.</w:t>
-            </w:r>
-          </w:p>
-        </w:tc>
-        <w:tc>
-          <w:tcPr>
-            <w:tcW w:w="2841" w:type="dxa"/>
-          </w:tcPr>
-          <w:p>
-            <w:pPr>
-              <w:numPr>
-                <w:numId w:val="0"/>
-              </w:numPr>
-              <w:jc w:val="both"/>
-              <w:rPr>
-                <w:rFonts w:hint="default" w:ascii="Times New Roman" w:hAnsi="Times New Roman" w:eastAsia="SimSun" w:cs="Times New Roman"/>
-                <w:b w:val="0"/>
-                <w:bCs w:val="0"/>
-                <w:sz w:val="24"/>
-                <w:szCs w:val="24"/>
-                <w:vertAlign w:val="baseline"/>
-                <w:lang w:val="en-US"/>
-              </w:rPr>
-            </w:pPr>
-            <w:r>
-              <w:rPr>
-                <w:rFonts w:hint="default" w:ascii="Times New Roman" w:hAnsi="Times New Roman" w:eastAsia="SimSun" w:cs="Times New Roman"/>
-                <w:b w:val="0"/>
-                <w:bCs w:val="0"/>
-                <w:sz w:val="24"/>
-                <w:szCs w:val="24"/>
-              </w:rPr>
-              <w:t>The bubble represents the entire task shared by both actors.</w:t>
-            </w:r>
-          </w:p>
-        </w:tc>
-      </w:tr>
-      <w:tr>
-        <w:tblPrEx>
-          <w:tblBorders>
-            <w:top w:val="single" w:color="auto" w:sz="4" w:space="0"/>
-            <w:left w:val="single" w:color="auto" w:sz="4" w:space="0"/>
-            <w:bottom w:val="single" w:color="auto" w:sz="4" w:space="0"/>
-            <w:right w:val="single" w:color="auto" w:sz="4" w:space="0"/>
-            <w:insideH w:val="single" w:color="auto" w:sz="4" w:space="0"/>
-            <w:insideV w:val="single" w:color="auto" w:sz="4" w:space="0"/>
-          </w:tblBorders>
-          <w:tblCellMar>
-            <w:left w:w="108" w:type="dxa"/>
-            <w:right w:w="108" w:type="dxa"/>
-          </w:tblCellMar>
-        </w:tblPrEx>
-        <w:tc>
-          <w:tcPr>
-            <w:tcW w:w="2840" w:type="dxa"/>
-          </w:tcPr>
-          <w:p>
-            <w:pPr>
-              <w:numPr>
-                <w:numId w:val="0"/>
-              </w:numPr>
-              <w:jc w:val="both"/>
-              <w:rPr>
-                <w:rFonts w:hint="default" w:ascii="Times New Roman" w:hAnsi="Times New Roman" w:eastAsia="SimSun" w:cs="Times New Roman"/>
-                <w:b w:val="0"/>
-                <w:bCs w:val="0"/>
-                <w:sz w:val="24"/>
-                <w:szCs w:val="24"/>
-                <w:vertAlign w:val="baseline"/>
-                <w:lang w:val="en-US"/>
-              </w:rPr>
-            </w:pPr>
-            <w:r>
-              <w:rPr>
-                <w:rFonts w:hint="default" w:ascii="Times New Roman" w:hAnsi="Times New Roman" w:eastAsia="SimSun" w:cs="Times New Roman"/>
-                <w:b w:val="0"/>
-                <w:bCs w:val="0"/>
-                <w:sz w:val="24"/>
-                <w:szCs w:val="24"/>
-              </w:rPr>
-              <w:t>Focuses only on what the computer performs.</w:t>
-            </w:r>
-          </w:p>
-        </w:tc>
-        <w:tc>
-          <w:tcPr>
-            <w:tcW w:w="2841" w:type="dxa"/>
-          </w:tcPr>
-          <w:p>
-            <w:pPr>
-              <w:numPr>
-                <w:numId w:val="0"/>
-              </w:numPr>
-              <w:jc w:val="both"/>
-              <w:rPr>
-                <w:rFonts w:hint="default" w:ascii="Times New Roman" w:hAnsi="Times New Roman" w:eastAsia="SimSun" w:cs="Times New Roman"/>
-                <w:b w:val="0"/>
-                <w:bCs w:val="0"/>
-                <w:sz w:val="24"/>
-                <w:szCs w:val="24"/>
-                <w:vertAlign w:val="baseline"/>
-                <w:lang w:val="en-US"/>
-              </w:rPr>
-            </w:pPr>
-            <w:r>
-              <w:rPr>
-                <w:rFonts w:hint="default" w:ascii="Times New Roman" w:hAnsi="Times New Roman" w:eastAsia="SimSun" w:cs="Times New Roman"/>
-                <w:b w:val="0"/>
-                <w:bCs w:val="0"/>
-                <w:sz w:val="24"/>
-                <w:szCs w:val="24"/>
-              </w:rPr>
-              <w:t>Forces a division of labor during the requirements phase.</w:t>
-            </w:r>
-          </w:p>
-        </w:tc>
-        <w:tc>
-          <w:tcPr>
-            <w:tcW w:w="2841" w:type="dxa"/>
-          </w:tcPr>
-          <w:p>
-            <w:pPr>
-              <w:numPr>
-                <w:numId w:val="0"/>
-              </w:numPr>
-              <w:jc w:val="both"/>
-              <w:rPr>
-                <w:rFonts w:hint="default" w:ascii="Times New Roman" w:hAnsi="Times New Roman" w:eastAsia="SimSun" w:cs="Times New Roman"/>
-                <w:b w:val="0"/>
-                <w:bCs w:val="0"/>
-                <w:sz w:val="24"/>
-                <w:szCs w:val="24"/>
-                <w:vertAlign w:val="baseline"/>
-                <w:lang w:val="en-US"/>
-              </w:rPr>
-            </w:pPr>
-            <w:r>
-              <w:rPr>
-                <w:rFonts w:hint="default" w:ascii="Times New Roman" w:hAnsi="Times New Roman" w:eastAsia="SimSun" w:cs="Times New Roman"/>
-                <w:b w:val="0"/>
-                <w:bCs w:val="0"/>
-                <w:sz w:val="24"/>
-                <w:szCs w:val="24"/>
-              </w:rPr>
-              <w:t>Postpones the split; human and computer carry out the task together.</w:t>
-            </w:r>
-          </w:p>
-        </w:tc>
-      </w:tr>
-    </w:tbl>
-    <w:p>
-      <w:pPr>
-        <w:numPr>
-          <w:numId w:val="0"/>
-        </w:numPr>
-        <w:jc w:val="both"/>
-        <w:rPr>
-          <w:rFonts w:hint="default" w:ascii="Times New Roman" w:hAnsi="Times New Roman" w:eastAsia="SimSun" w:cs="Times New Roman"/>
-          <w:sz w:val="24"/>
-          <w:szCs w:val="24"/>
-          <w:lang w:val="en-US"/>
-        </w:rPr>
-      </w:pPr>
-    </w:p>
-    <w:p>
-      <w:pPr>
-        <w:numPr>
-          <w:numId w:val="0"/>
-        </w:numPr>
-        <w:jc w:val="both"/>
-        <w:rPr>
-          <w:rFonts w:hint="default" w:ascii="Times New Roman" w:hAnsi="Times New Roman" w:eastAsia="SimSun" w:cs="Times New Roman"/>
-          <w:b w:val="0"/>
-          <w:bCs w:val="0"/>
-          <w:sz w:val="24"/>
-          <w:szCs w:val="24"/>
-          <w:lang w:val="en-US"/>
-        </w:rPr>
-      </w:pPr>
-      <w:r>
-        <w:rPr>
-          <w:rFonts w:hint="default" w:ascii="Times New Roman" w:hAnsi="Times New Roman" w:eastAsia="SimSun" w:cs="Times New Roman"/>
-          <w:sz w:val="24"/>
-          <w:szCs w:val="24"/>
-          <w:lang w:val="en-US"/>
-        </w:rPr>
-        <w:t xml:space="preserve">- Structure of Task Description: </w:t>
-      </w:r>
-      <w:r>
-        <w:rPr>
-          <w:rFonts w:hint="default" w:ascii="Times New Roman" w:hAnsi="Times New Roman" w:eastAsia="SimSun" w:cs="Times New Roman"/>
-          <w:sz w:val="24"/>
-          <w:szCs w:val="24"/>
-        </w:rPr>
-        <w:t xml:space="preserve">A high-quality task description includes several key </w:t>
-      </w:r>
-      <w:r>
-        <w:rPr>
-          <w:rFonts w:hint="default" w:ascii="Times New Roman" w:hAnsi="Times New Roman" w:eastAsia="SimSun" w:cs="Times New Roman"/>
-          <w:b w:val="0"/>
-          <w:bCs w:val="0"/>
-          <w:sz w:val="24"/>
-          <w:szCs w:val="24"/>
-        </w:rPr>
-        <w:t>components:</w:t>
-      </w:r>
-    </w:p>
-    <w:p>
-      <w:pPr>
-        <w:pStyle w:val="4"/>
-        <w:keepNext w:val="0"/>
-        <w:keepLines w:val="0"/>
-        <w:widowControl/>
-        <w:suppressLineNumbers w:val="0"/>
-        <w:spacing w:before="0" w:beforeAutospacing="0" w:line="14" w:lineRule="atLeast"/>
-        <w:rPr>
-          <w:rFonts w:hint="default" w:ascii="Times New Roman" w:hAnsi="Times New Roman" w:eastAsia="sans-serif" w:cs="Times New Roman"/>
-          <w:b w:val="0"/>
-          <w:bCs w:val="0"/>
-        </w:rPr>
-      </w:pPr>
-      <w:r>
-        <w:rPr>
-          <w:rFonts w:hint="default" w:ascii="Times New Roman" w:hAnsi="Times New Roman" w:eastAsia="SimSun" w:cs="Times New Roman"/>
-          <w:b w:val="0"/>
-          <w:bCs w:val="0"/>
-          <w:sz w:val="24"/>
-          <w:szCs w:val="24"/>
-          <w:lang w:val="en-US"/>
-        </w:rPr>
-        <w:t xml:space="preserve">    + </w:t>
-      </w:r>
-      <w:r>
-        <w:rPr>
-          <w:rFonts w:hint="default" w:ascii="Times New Roman" w:hAnsi="Times New Roman" w:eastAsia="sans-serif" w:cs="Times New Roman"/>
-          <w:b w:val="0"/>
-          <w:bCs w:val="0"/>
-        </w:rPr>
-        <w:t xml:space="preserve">Purpose: The goal or state change desired, such as "Give guest a room". </w:t>
-      </w:r>
-    </w:p>
-    <w:p>
-      <w:pPr>
-        <w:pStyle w:val="4"/>
-        <w:keepNext w:val="0"/>
-        <w:keepLines w:val="0"/>
-        <w:widowControl/>
-        <w:suppressLineNumbers w:val="0"/>
-        <w:spacing w:before="0" w:beforeAutospacing="0" w:line="14" w:lineRule="atLeast"/>
-        <w:ind w:firstLine="240" w:firstLineChars="100"/>
-        <w:rPr>
-          <w:rFonts w:hint="default" w:ascii="Times New Roman" w:hAnsi="Times New Roman" w:eastAsia="sans-serif" w:cs="Times New Roman"/>
-          <w:b w:val="0"/>
-          <w:bCs w:val="0"/>
-        </w:rPr>
-      </w:pPr>
-      <w:r>
-        <w:rPr>
-          <w:rFonts w:hint="default" w:ascii="Times New Roman" w:hAnsi="Times New Roman" w:eastAsia="sans-serif" w:cs="Times New Roman"/>
-          <w:b w:val="0"/>
-          <w:bCs w:val="0"/>
-          <w:lang w:val="en-US"/>
-        </w:rPr>
-        <w:t xml:space="preserve">+ </w:t>
-      </w:r>
-      <w:r>
-        <w:rPr>
-          <w:rFonts w:hint="default" w:ascii="Times New Roman" w:hAnsi="Times New Roman" w:eastAsia="sans-serif" w:cs="Times New Roman"/>
-          <w:b w:val="0"/>
-          <w:bCs w:val="0"/>
-        </w:rPr>
-        <w:t xml:space="preserve">Trigger: The event that initiates the task, like "A guest arrives". </w:t>
-      </w:r>
-    </w:p>
-    <w:p>
-      <w:pPr>
-        <w:pStyle w:val="4"/>
-        <w:keepNext w:val="0"/>
-        <w:keepLines w:val="0"/>
-        <w:widowControl/>
-        <w:suppressLineNumbers w:val="0"/>
-        <w:spacing w:before="0" w:beforeAutospacing="0" w:line="14" w:lineRule="atLeast"/>
-        <w:ind w:firstLine="240" w:firstLineChars="100"/>
-        <w:rPr>
-          <w:rFonts w:hint="default" w:ascii="Times New Roman" w:hAnsi="Times New Roman" w:eastAsia="sans-serif" w:cs="Times New Roman"/>
-          <w:b w:val="0"/>
-          <w:bCs w:val="0"/>
-        </w:rPr>
-      </w:pPr>
-      <w:r>
-        <w:rPr>
-          <w:rFonts w:hint="default" w:ascii="Times New Roman" w:hAnsi="Times New Roman" w:eastAsia="sans-serif" w:cs="Times New Roman"/>
-          <w:b w:val="0"/>
-          <w:bCs w:val="0"/>
-          <w:lang w:val="en-US"/>
-        </w:rPr>
-        <w:t xml:space="preserve">+ </w:t>
-      </w:r>
-      <w:r>
-        <w:rPr>
-          <w:rFonts w:hint="default" w:ascii="Times New Roman" w:hAnsi="Times New Roman" w:eastAsia="sans-serif" w:cs="Times New Roman"/>
-          <w:b w:val="0"/>
-          <w:bCs w:val="0"/>
-        </w:rPr>
-        <w:t xml:space="preserve">Subtasks: Steps required to complete the goal, written in imperative language (e.g., "Find room"). </w:t>
-      </w:r>
-    </w:p>
-    <w:p>
-      <w:pPr>
-        <w:pStyle w:val="4"/>
-        <w:keepNext w:val="0"/>
-        <w:keepLines w:val="0"/>
-        <w:widowControl/>
-        <w:suppressLineNumbers w:val="0"/>
-        <w:spacing w:before="0" w:beforeAutospacing="0" w:line="14" w:lineRule="atLeast"/>
-        <w:ind w:firstLine="240" w:firstLineChars="100"/>
-        <w:rPr>
-          <w:rFonts w:hint="default" w:ascii="Times New Roman" w:hAnsi="Times New Roman" w:eastAsia="sans-serif" w:cs="Times New Roman"/>
-          <w:b w:val="0"/>
-          <w:bCs w:val="0"/>
-        </w:rPr>
-      </w:pPr>
-      <w:r>
-        <w:rPr>
-          <w:rFonts w:hint="default" w:ascii="Times New Roman" w:hAnsi="Times New Roman" w:eastAsia="sans-serif" w:cs="Times New Roman"/>
-          <w:b w:val="0"/>
-          <w:bCs w:val="0"/>
-          <w:lang w:val="en-US"/>
-        </w:rPr>
-        <w:t xml:space="preserve">+ </w:t>
-      </w:r>
-      <w:r>
-        <w:rPr>
-          <w:rFonts w:hint="default" w:ascii="Times New Roman" w:hAnsi="Times New Roman" w:eastAsia="sans-serif" w:cs="Times New Roman"/>
-          <w:b w:val="0"/>
-          <w:bCs w:val="0"/>
-        </w:rPr>
-        <w:t xml:space="preserve">Variants: Special cases or exceptions, such as "No suitable room" or "Regular customer". </w:t>
-      </w:r>
-    </w:p>
-    <w:p>
-      <w:pPr>
-        <w:numPr>
-          <w:numId w:val="0"/>
-        </w:numPr>
-        <w:jc w:val="both"/>
-        <w:rPr>
-          <w:rFonts w:hint="default" w:ascii="Times New Roman" w:hAnsi="Times New Roman" w:eastAsia="SimSun" w:cs="Times New Roman"/>
-          <w:sz w:val="24"/>
-          <w:szCs w:val="24"/>
-        </w:rPr>
-      </w:pPr>
-      <w:r>
-        <w:rPr>
-          <w:rFonts w:hint="default" w:ascii="Times New Roman" w:hAnsi="Times New Roman" w:eastAsia="SimSun" w:cs="Times New Roman"/>
-          <w:sz w:val="24"/>
-          <w:szCs w:val="24"/>
-          <w:lang w:val="en-US"/>
-        </w:rPr>
-        <w:t xml:space="preserve">- The Task and Support Table: </w:t>
-      </w:r>
-      <w:r>
-        <w:rPr>
-          <w:rFonts w:hint="default" w:ascii="Times New Roman" w:hAnsi="Times New Roman" w:eastAsia="SimSun" w:cs="Times New Roman"/>
-          <w:sz w:val="24"/>
-          <w:szCs w:val="24"/>
-        </w:rPr>
-        <w:t>This format links domain-level activities directly to potential technical solutions:</w:t>
-      </w:r>
-    </w:p>
-    <w:p>
-      <w:pPr>
-        <w:numPr>
-          <w:numId w:val="0"/>
-        </w:numPr>
-        <w:jc w:val="both"/>
-        <w:rPr>
-          <w:rFonts w:hint="default" w:ascii="Times New Roman" w:hAnsi="Times New Roman" w:eastAsia="SimSun" w:cs="Times New Roman"/>
-          <w:sz w:val="24"/>
-          <w:szCs w:val="24"/>
-        </w:rPr>
-      </w:pPr>
-    </w:p>
-    <w:tbl>
-      <w:tblPr>
-        <w:tblStyle w:val="5"/>
-        <w:tblW w:w="0" w:type="auto"/>
-        <w:tblInd w:w="0" w:type="dxa"/>
-        <w:tblBorders>
-          <w:top w:val="single" w:color="auto" w:sz="4" w:space="0"/>
-          <w:left w:val="single" w:color="auto" w:sz="4" w:space="0"/>
-          <w:bottom w:val="single" w:color="auto" w:sz="4" w:space="0"/>
-          <w:right w:val="single" w:color="auto" w:sz="4" w:space="0"/>
-          <w:insideH w:val="single" w:color="auto" w:sz="4" w:space="0"/>
-          <w:insideV w:val="single" w:color="auto" w:sz="4" w:space="0"/>
-        </w:tblBorders>
-        <w:tblLayout w:type="autofit"/>
-        <w:tblCellMar>
-          <w:left w:w="108" w:type="dxa"/>
-          <w:right w:w="108" w:type="dxa"/>
-        </w:tblCellMar>
-      </w:tblPr>
-      <w:tblGrid>
-        <w:gridCol w:w="2840"/>
-        <w:gridCol w:w="2841"/>
-        <w:gridCol w:w="2841"/>
-      </w:tblGrid>
-      <w:tr>
-        <w:tblPrEx>
-          <w:tblBorders>
-            <w:top w:val="single" w:color="auto" w:sz="4" w:space="0"/>
-            <w:left w:val="single" w:color="auto" w:sz="4" w:space="0"/>
-            <w:bottom w:val="single" w:color="auto" w:sz="4" w:space="0"/>
-            <w:right w:val="single" w:color="auto" w:sz="4" w:space="0"/>
-            <w:insideH w:val="single" w:color="auto" w:sz="4" w:space="0"/>
-            <w:insideV w:val="single" w:color="auto" w:sz="4" w:space="0"/>
-          </w:tblBorders>
-          <w:tblCellMar>
-            <w:left w:w="108" w:type="dxa"/>
-            <w:right w:w="108" w:type="dxa"/>
-          </w:tblCellMar>
-        </w:tblPrEx>
-        <w:tc>
-          <w:tcPr>
-            <w:tcW w:w="2840" w:type="dxa"/>
-          </w:tcPr>
-          <w:p>
-            <w:pPr>
-              <w:numPr>
+                <w:ilvl w:val="0"/>
                 <w:numId w:val="0"/>
               </w:numPr>
               <w:jc w:val="center"/>
@@ -878,7 +923,9 @@
           </w:tcPr>
           <w:p>
             <w:pPr>
+              <w:widowControl w:val="0"/>
               <w:numPr>
+                <w:ilvl w:val="0"/>
                 <w:numId w:val="0"/>
               </w:numPr>
               <w:jc w:val="center"/>
@@ -910,7 +957,9 @@
           </w:tcPr>
           <w:p>
             <w:pPr>
+              <w:widowControl w:val="0"/>
               <w:numPr>
+                <w:ilvl w:val="0"/>
                 <w:numId w:val="0"/>
               </w:numPr>
               <w:jc w:val="center"/>
@@ -948,7 +997,9 @@
             <w:insideV w:val="single" w:color="auto" w:sz="4" w:space="0"/>
           </w:tblBorders>
           <w:tblCellMar>
+            <w:top w:w="0" w:type="dxa"/>
             <w:left w:w="108" w:type="dxa"/>
+            <w:bottom w:w="0" w:type="dxa"/>
             <w:right w:w="108" w:type="dxa"/>
           </w:tblCellMar>
         </w:tblPrEx>
@@ -958,7 +1009,9 @@
           </w:tcPr>
           <w:p>
             <w:pPr>
+              <w:widowControl w:val="0"/>
               <w:numPr>
+                <w:ilvl w:val="0"/>
                 <w:numId w:val="0"/>
               </w:numPr>
               <w:jc w:val="both"/>
@@ -986,7 +1039,9 @@
           </w:tcPr>
           <w:p>
             <w:pPr>
+              <w:widowControl w:val="0"/>
               <w:numPr>
+                <w:ilvl w:val="0"/>
                 <w:numId w:val="0"/>
               </w:numPr>
               <w:jc w:val="both"/>
@@ -1014,7 +1069,9 @@
           </w:tcPr>
           <w:p>
             <w:pPr>
+              <w:widowControl w:val="0"/>
               <w:numPr>
+                <w:ilvl w:val="0"/>
                 <w:numId w:val="0"/>
               </w:numPr>
               <w:jc w:val="both"/>
@@ -1048,7 +1105,9 @@
             <w:insideV w:val="single" w:color="auto" w:sz="4" w:space="0"/>
           </w:tblBorders>
           <w:tblCellMar>
+            <w:top w:w="0" w:type="dxa"/>
             <w:left w:w="108" w:type="dxa"/>
+            <w:bottom w:w="0" w:type="dxa"/>
             <w:right w:w="108" w:type="dxa"/>
           </w:tblCellMar>
         </w:tblPrEx>
@@ -1058,7 +1117,9 @@
           </w:tcPr>
           <w:p>
             <w:pPr>
+              <w:widowControl w:val="0"/>
               <w:numPr>
+                <w:ilvl w:val="0"/>
                 <w:numId w:val="0"/>
               </w:numPr>
               <w:jc w:val="both"/>
@@ -1114,7 +1175,9 @@
           </w:tcPr>
           <w:p>
             <w:pPr>
+              <w:widowControl w:val="0"/>
               <w:numPr>
+                <w:ilvl w:val="0"/>
                 <w:numId w:val="0"/>
               </w:numPr>
               <w:jc w:val="both"/>
@@ -1141,6 +1204,7 @@
     <w:p>
       <w:pPr>
         <w:numPr>
+          <w:ilvl w:val="0"/>
           <w:numId w:val="0"/>
         </w:numPr>
         <w:jc w:val="both"/>
@@ -1155,6 +1219,7 @@
     <w:p>
       <w:pPr>
         <w:numPr>
+          <w:ilvl w:val="0"/>
           <w:numId w:val="0"/>
         </w:numPr>
         <w:jc w:val="both"/>
@@ -1358,6 +1423,7 @@
         <w:keepLines w:val="0"/>
         <w:widowControl/>
         <w:numPr>
+          <w:ilvl w:val="0"/>
           <w:numId w:val="0"/>
         </w:numPr>
         <w:suppressLineNumbers w:val="0"/>
@@ -1398,6 +1464,7 @@
     <w:p>
       <w:pPr>
         <w:numPr>
+          <w:ilvl w:val="0"/>
           <w:numId w:val="0"/>
         </w:numPr>
         <w:rPr>
@@ -1568,6 +1635,7 @@
         <w:keepLines w:val="0"/>
         <w:widowControl/>
         <w:numPr>
+          <w:ilvl w:val="0"/>
           <w:numId w:val="0"/>
         </w:numPr>
         <w:suppressLineNumbers w:val="0"/>
@@ -1958,6 +2026,7 @@
         <w:keepLines w:val="0"/>
         <w:widowControl/>
         <w:numPr>
+          <w:ilvl w:val="0"/>
           <w:numId w:val="0"/>
         </w:numPr>
         <w:suppressLineNumbers w:val="0"/>
@@ -2080,6 +2149,7 @@
         <w:keepLines w:val="0"/>
         <w:widowControl/>
         <w:numPr>
+          <w:ilvl w:val="0"/>
           <w:numId w:val="0"/>
         </w:numPr>
         <w:suppressLineNumbers w:val="0"/>
@@ -2097,6 +2167,7 @@
         <w:keepLines w:val="0"/>
         <w:widowControl/>
         <w:numPr>
+          <w:ilvl w:val="0"/>
           <w:numId w:val="0"/>
         </w:numPr>
         <w:suppressLineNumbers w:val="0"/>
@@ -2106,6 +2177,253 @@
           <w:rFonts w:hint="default" w:ascii="Times New Roman" w:hAnsi="Times New Roman" w:cs="Times New Roman"/>
         </w:rPr>
       </w:pPr>
+    </w:p>
+    <w:p>
+      <w:pPr>
+        <w:pStyle w:val="4"/>
+        <w:keepNext w:val="0"/>
+        <w:keepLines w:val="0"/>
+        <w:widowControl/>
+        <w:numPr>
+          <w:ilvl w:val="0"/>
+          <w:numId w:val="0"/>
+        </w:numPr>
+        <w:suppressLineNumbers w:val="0"/>
+        <w:spacing w:before="0" w:beforeAutospacing="0" w:line="14" w:lineRule="atLeast"/>
+        <w:ind w:right="0" w:rightChars="0"/>
+        <w:rPr>
+          <w:rFonts w:hint="default" w:ascii="Times New Roman" w:hAnsi="Times New Roman" w:eastAsia="SimSun" w:cs="Times New Roman"/>
+          <w:sz w:val="24"/>
+          <w:szCs w:val="24"/>
+        </w:rPr>
+      </w:pPr>
+    </w:p>
+    <w:p>
+      <w:pPr>
+        <w:pStyle w:val="4"/>
+        <w:keepNext w:val="0"/>
+        <w:keepLines w:val="0"/>
+        <w:widowControl/>
+        <w:numPr>
+          <w:ilvl w:val="0"/>
+          <w:numId w:val="0"/>
+        </w:numPr>
+        <w:suppressLineNumbers w:val="0"/>
+        <w:spacing w:before="0" w:beforeAutospacing="0" w:line="14" w:lineRule="atLeast"/>
+        <w:ind w:right="0" w:rightChars="0"/>
+        <w:rPr>
+          <w:rFonts w:hint="default" w:cs="Times New Roman"/>
+          <w:sz w:val="24"/>
+          <w:szCs w:val="24"/>
+          <w:lang w:val="en-US"/>
+        </w:rPr>
+      </w:pPr>
+      <w:r>
+        <w:rPr>
+          <w:rFonts w:hint="default" w:cs="Times New Roman"/>
+          <w:sz w:val="24"/>
+          <w:szCs w:val="24"/>
+          <w:lang w:val="en-US"/>
+        </w:rPr>
+        <w:t>Questions:</w:t>
+      </w:r>
+      <w:r>
+        <w:rPr>
+          <w:rFonts w:hint="default" w:cs="Times New Roman"/>
+          <w:sz w:val="24"/>
+          <w:szCs w:val="24"/>
+          <w:lang w:val="en-US"/>
+        </w:rPr>
+        <w:br w:type="textWrapping"/>
+      </w:r>
+      <w:r>
+        <w:rPr>
+          <w:rFonts w:hint="default" w:cs="Times New Roman"/>
+          <w:sz w:val="24"/>
+          <w:szCs w:val="24"/>
+          <w:lang w:val="en-US"/>
+        </w:rPr>
+        <w:t>1. If stuck in the technical problem within 2 hours, what is the next step? =&gt; Ask lecturer</w:t>
+      </w:r>
+    </w:p>
+    <w:p>
+      <w:pPr>
+        <w:pStyle w:val="4"/>
+        <w:keepNext w:val="0"/>
+        <w:keepLines w:val="0"/>
+        <w:widowControl/>
+        <w:numPr>
+          <w:ilvl w:val="0"/>
+          <w:numId w:val="3"/>
+        </w:numPr>
+        <w:suppressLineNumbers w:val="0"/>
+        <w:spacing w:before="0" w:beforeAutospacing="0" w:line="14" w:lineRule="atLeast"/>
+        <w:ind w:right="0" w:rightChars="0"/>
+        <w:rPr>
+          <w:rFonts w:hint="default" w:cs="Times New Roman"/>
+          <w:sz w:val="24"/>
+          <w:szCs w:val="24"/>
+          <w:lang w:val="en-US"/>
+        </w:rPr>
+      </w:pPr>
+      <w:r>
+        <w:rPr>
+          <w:rFonts w:hint="default" w:cs="Times New Roman"/>
+          <w:sz w:val="24"/>
+          <w:szCs w:val="24"/>
+          <w:lang w:val="en-US"/>
+        </w:rPr>
+        <w:t xml:space="preserve">Difference between verifycation and Validation: </w:t>
+      </w:r>
+    </w:p>
+    <w:p>
+      <w:pPr>
+        <w:pStyle w:val="4"/>
+        <w:keepNext w:val="0"/>
+        <w:keepLines w:val="0"/>
+        <w:widowControl/>
+        <w:numPr>
+          <w:ilvl w:val="0"/>
+          <w:numId w:val="3"/>
+        </w:numPr>
+        <w:suppressLineNumbers w:val="0"/>
+        <w:spacing w:before="0" w:beforeAutospacing="0" w:line="14" w:lineRule="atLeast"/>
+        <w:ind w:right="0" w:rightChars="0"/>
+        <w:rPr>
+          <w:rFonts w:hint="default" w:cs="Times New Roman"/>
+          <w:sz w:val="24"/>
+          <w:szCs w:val="24"/>
+          <w:lang w:val="en-US"/>
+        </w:rPr>
+      </w:pPr>
+      <w:r>
+        <w:rPr>
+          <w:rFonts w:hint="default" w:cs="Times New Roman"/>
+          <w:sz w:val="24"/>
+          <w:szCs w:val="24"/>
+          <w:lang w:val="en-US"/>
+        </w:rPr>
+        <w:t>SDLC Topics =&gt; next week</w:t>
+      </w:r>
+    </w:p>
+    <w:p>
+      <w:pPr>
+        <w:pStyle w:val="4"/>
+        <w:keepNext w:val="0"/>
+        <w:keepLines w:val="0"/>
+        <w:widowControl/>
+        <w:numPr>
+          <w:ilvl w:val="0"/>
+          <w:numId w:val="3"/>
+        </w:numPr>
+        <w:suppressLineNumbers w:val="0"/>
+        <w:spacing w:before="0" w:beforeAutospacing="0" w:line="14" w:lineRule="atLeast"/>
+        <w:ind w:right="0" w:rightChars="0"/>
+        <w:rPr>
+          <w:rFonts w:hint="default" w:cs="Times New Roman"/>
+          <w:sz w:val="24"/>
+          <w:szCs w:val="24"/>
+          <w:lang w:val="en-US"/>
+        </w:rPr>
+      </w:pPr>
+      <w:r>
+        <w:rPr>
+          <w:rFonts w:hint="default" w:cs="Times New Roman"/>
+          <w:sz w:val="24"/>
+          <w:szCs w:val="24"/>
+          <w:lang w:val="en-US"/>
+        </w:rPr>
+        <w:t>If a client wants a chat inside their app, what is the first question =&gt; Why you need chat version? What scenario would you like to you this chat?</w:t>
+      </w:r>
+    </w:p>
+    <w:p>
+      <w:pPr>
+        <w:pStyle w:val="4"/>
+        <w:keepNext w:val="0"/>
+        <w:keepLines w:val="0"/>
+        <w:widowControl/>
+        <w:numPr>
+          <w:numId w:val="0"/>
+        </w:numPr>
+        <w:suppressLineNumbers w:val="0"/>
+        <w:spacing w:before="0" w:beforeAutospacing="0" w:line="14" w:lineRule="atLeast"/>
+        <w:ind w:right="0" w:rightChars="0"/>
+        <w:rPr>
+          <w:rFonts w:hint="default" w:cs="Times New Roman"/>
+          <w:sz w:val="24"/>
+          <w:szCs w:val="24"/>
+          <w:lang w:val="en-US"/>
+        </w:rPr>
+      </w:pPr>
+      <w:r>
+        <w:rPr>
+          <w:rFonts w:hint="default" w:cs="Times New Roman"/>
+          <w:sz w:val="24"/>
+          <w:szCs w:val="24"/>
+          <w:lang w:val="en-US"/>
+        </w:rPr>
+        <w:t>*Note: Remember carefully about the Goal level requirements, domain level requirements, product level requirements, and design level requirements and its application (slide 26 and 27 in week 2), Slide26 to the end can be used for assignment1</w:t>
+      </w:r>
+    </w:p>
+    <w:p>
+      <w:pPr>
+        <w:pStyle w:val="4"/>
+        <w:keepNext w:val="0"/>
+        <w:keepLines w:val="0"/>
+        <w:widowControl/>
+        <w:numPr>
+          <w:ilvl w:val="0"/>
+          <w:numId w:val="3"/>
+        </w:numPr>
+        <w:suppressLineNumbers w:val="0"/>
+        <w:spacing w:before="0" w:beforeAutospacing="0" w:line="14" w:lineRule="atLeast"/>
+        <w:ind w:left="0" w:leftChars="0" w:right="0" w:rightChars="0" w:firstLine="0" w:firstLineChars="0"/>
+        <w:rPr>
+          <w:rFonts w:hint="default" w:cs="Times New Roman"/>
+          <w:sz w:val="24"/>
+          <w:szCs w:val="24"/>
+          <w:lang w:val="en-US"/>
+        </w:rPr>
+      </w:pPr>
+      <w:r>
+        <w:rPr>
+          <w:rFonts w:hint="default" w:cs="Times New Roman"/>
+          <w:sz w:val="24"/>
+          <w:szCs w:val="24"/>
+          <w:lang w:val="en-US"/>
+        </w:rPr>
+        <w:t>Difference between domain entity and database entity?</w:t>
+      </w:r>
+    </w:p>
+    <w:p>
+      <w:pPr>
+        <w:pStyle w:val="4"/>
+        <w:keepNext w:val="0"/>
+        <w:keepLines w:val="0"/>
+        <w:widowControl/>
+        <w:numPr>
+          <w:ilvl w:val="0"/>
+          <w:numId w:val="3"/>
+        </w:numPr>
+        <w:suppressLineNumbers w:val="0"/>
+        <w:spacing w:before="0" w:beforeAutospacing="0" w:line="14" w:lineRule="atLeast"/>
+        <w:ind w:left="0" w:leftChars="0" w:right="0" w:rightChars="0" w:firstLine="0" w:firstLineChars="0"/>
+        <w:rPr>
+          <w:rFonts w:hint="default" w:cs="Times New Roman"/>
+          <w:sz w:val="24"/>
+          <w:szCs w:val="24"/>
+          <w:lang w:val="en-US"/>
+        </w:rPr>
+      </w:pPr>
+      <w:r>
+        <w:rPr>
+          <w:rFonts w:hint="default" w:cs="Times New Roman"/>
+          <w:sz w:val="24"/>
+          <w:szCs w:val="24"/>
+          <w:lang w:val="en-US"/>
+        </w:rPr>
+        <w:t>Homework: Book a ride =&gt; based on slide 18</w:t>
+      </w:r>
       <w:bookmarkStart w:id="0" w:name="_GoBack"/>
       <w:bookmarkEnd w:id="0"/>
     </w:p>
@@ -2116,45 +2434,7 @@
         <w:keepLines w:val="0"/>
         <w:widowControl/>
         <w:numPr>
-          <w:numId w:val="0"/>
-        </w:numPr>
-        <w:suppressLineNumbers w:val="0"/>
-        <w:spacing w:before="0" w:beforeAutospacing="0" w:line="14" w:lineRule="atLeast"/>
-        <w:ind w:right="0" w:rightChars="0"/>
-        <w:rPr>
-          <w:rFonts w:hint="default" w:ascii="Times New Roman" w:hAnsi="Times New Roman" w:eastAsia="SimSun" w:cs="Times New Roman"/>
-          <w:sz w:val="24"/>
-          <w:szCs w:val="24"/>
-        </w:rPr>
-      </w:pPr>
-    </w:p>
-    <w:p>
-      <w:pPr>
-        <w:pStyle w:val="4"/>
-        <w:keepNext w:val="0"/>
-        <w:keepLines w:val="0"/>
-        <w:widowControl/>
-        <w:numPr>
-          <w:numId w:val="0"/>
-        </w:numPr>
-        <w:suppressLineNumbers w:val="0"/>
-        <w:spacing w:before="0" w:beforeAutospacing="0" w:line="14" w:lineRule="atLeast"/>
-        <w:ind w:right="0" w:rightChars="0"/>
-        <w:rPr>
-          <w:rFonts w:hint="default" w:ascii="Times New Roman" w:hAnsi="Times New Roman" w:eastAsia="SimSun" w:cs="Times New Roman"/>
-          <w:sz w:val="24"/>
-          <w:szCs w:val="24"/>
-          <w:lang w:val="en-US"/>
-        </w:rPr>
-      </w:pPr>
-    </w:p>
-    <w:p>
-      <w:pPr>
-        <w:pStyle w:val="4"/>
-        <w:keepNext w:val="0"/>
-        <w:keepLines w:val="0"/>
-        <w:widowControl/>
-        <w:numPr>
+          <w:ilvl w:val="0"/>
           <w:numId w:val="0"/>
         </w:numPr>
         <w:suppressLineNumbers w:val="0"/>
@@ -2173,6 +2453,7 @@
     <w:p>
       <w:pPr>
         <w:numPr>
+          <w:ilvl w:val="0"/>
           <w:numId w:val="0"/>
         </w:numPr>
         <w:rPr>
@@ -2192,6 +2473,7 @@
         <w:keepLines w:val="0"/>
         <w:widowControl/>
         <w:numPr>
+          <w:ilvl w:val="0"/>
           <w:numId w:val="0"/>
         </w:numPr>
         <w:suppressLineNumbers w:val="0"/>
@@ -2216,6 +2498,18 @@
 <file path=word/numbering.xml><?xml version="1.0" encoding="utf-8"?>
 <w:numbering xmlns:wpc="http://schemas.microsoft.com/office/word/2010/wordprocessingCanvas" xmlns:mc="http://schemas.openxmlformats.org/markup-compatibility/2006" xmlns:o="urn:schemas-microsoft-com:office:office" xmlns:r="http://schemas.openxmlformats.org/officeDocument/2006/relationships" xmlns:m="http://schemas.openxmlformats.org/officeDocument/2006/math" xmlns:v="urn:schemas-microsoft-com:vml" xmlns:wp14="http://schemas.microsoft.com/office/word/2010/wordprocessingDrawing" xmlns:wp="http://schemas.openxmlformats.org/drawingml/2006/wordprocessingDrawing" xmlns:w10="urn:schemas-microsoft-com:office:word" xmlns:w="http://schemas.openxmlformats.org/wordprocessingml/2006/main" xmlns:w14="http://schemas.microsoft.com/office/word/2010/wordml" xmlns:wpg="http://schemas.microsoft.com/office/word/2010/wordprocessingGroup" xmlns:wpi="http://schemas.microsoft.com/office/word/2010/wordprocessingInk" xmlns:wne="http://schemas.microsoft.com/office/word/2006/wordml" xmlns:wps="http://schemas.microsoft.com/office/word/2010/wordprocessingShape" xmlns:wpsCustomData="http://www.wps.cn/officeDocument/2013/wpsCustomData" mc:Ignorable="w14 wp14">
   <w:abstractNum w:abstractNumId="0">
+    <w:nsid w:val="CE66EBA7"/>
+    <w:multiLevelType w:val="singleLevel"/>
+    <w:tmpl w:val="CE66EBA7"/>
+    <w:lvl w:ilvl="0" w:tentative="0">
+      <w:start w:val="2"/>
+      <w:numFmt w:val="decimal"/>
+      <w:suff w:val="space"/>
+      <w:lvlText w:val="%1."/>
+      <w:lvlJc w:val="left"/>
+    </w:lvl>
+  </w:abstractNum>
+  <w:abstractNum w:abstractNumId="1">
     <w:nsid w:val="0AFC57A4"/>
     <w:multiLevelType w:val="singleLevel"/>
     <w:tmpl w:val="0AFC57A4"/>
@@ -2227,7 +2521,7 @@
       <w:lvlJc w:val="left"/>
     </w:lvl>
   </w:abstractNum>
-  <w:abstractNum w:abstractNumId="1">
+  <w:abstractNum w:abstractNumId="2">
     <w:nsid w:val="11F06918"/>
     <w:multiLevelType w:val="singleLevel"/>
     <w:tmpl w:val="11F06918"/>
@@ -2250,10 +2544,13 @@
     </w:lvl>
   </w:abstractNum>
   <w:num w:numId="1">
-    <w:abstractNumId w:val="0"/>
+    <w:abstractNumId w:val="1"/>
   </w:num>
   <w:num w:numId="2">
-    <w:abstractNumId w:val="1"/>
+    <w:abstractNumId w:val="2"/>
+  </w:num>
+  <w:num w:numId="3">
+    <w:abstractNumId w:val="0"/>
   </w:num>
 </w:numbering>
 </file>
@@ -2361,7 +2658,7 @@
     <w:lsdException w:unhideWhenUsed="0" w:uiPriority="0" w:semiHidden="0" w:name="Document Map"/>
     <w:lsdException w:unhideWhenUsed="0" w:uiPriority="0" w:semiHidden="0" w:name="Plain Text"/>
     <w:lsdException w:unhideWhenUsed="0" w:uiPriority="0" w:semiHidden="0" w:name="E-mail Signature"/>
-    <w:lsdException w:unhideWhenUsed="0" w:uiPriority="0" w:semiHidden="0" w:name="Normal (Web)"/>
+    <w:lsdException w:qFormat="1" w:unhideWhenUsed="0" w:uiPriority="0" w:semiHidden="0" w:name="Normal (Web)"/>
     <w:lsdException w:unhideWhenUsed="0" w:uiPriority="0" w:semiHidden="0" w:name="HTML Acronym"/>
     <w:lsdException w:unhideWhenUsed="0" w:uiPriority="0" w:semiHidden="0" w:name="HTML Address"/>
     <w:lsdException w:unhideWhenUsed="0" w:uiPriority="0" w:semiHidden="0" w:name="HTML Cite"/>
@@ -2417,7 +2714,7 @@
     <w:lsdException w:unhideWhenUsed="0" w:uiPriority="0" w:semiHidden="0" w:name="Table Web 2"/>
     <w:lsdException w:unhideWhenUsed="0" w:uiPriority="0" w:semiHidden="0" w:name="Table Web 3"/>
     <w:lsdException w:unhideWhenUsed="0" w:uiPriority="0" w:semiHidden="0" w:name="Balloon Text"/>
-    <w:lsdException w:unhideWhenUsed="0" w:uiPriority="0" w:semiHidden="0" w:name="Table Grid"/>
+    <w:lsdException w:qFormat="1" w:unhideWhenUsed="0" w:uiPriority="0" w:semiHidden="0" w:name="Table Grid"/>
     <w:lsdException w:unhideWhenUsed="0" w:uiPriority="0" w:semiHidden="0" w:name="Table Theme"/>
     <w:lsdException w:unhideWhenUsed="0" w:uiPriority="60" w:semiHidden="0" w:name="Light Shading"/>
     <w:lsdException w:unhideWhenUsed="0" w:uiPriority="61" w:semiHidden="0" w:name="Light List"/>
@@ -2549,6 +2846,7 @@
   </w:style>
   <w:style w:type="paragraph" w:styleId="4">
     <w:name w:val="Normal (Web)"/>
+    <w:qFormat/>
     <w:uiPriority w:val="0"/>
     <w:pPr>
       <w:spacing w:before="0" w:beforeAutospacing="1" w:after="0" w:afterAutospacing="1"/>
@@ -2556,6 +2854,7 @@
       <w:jc w:val="left"/>
     </w:pPr>
     <w:rPr>
+      <w:rFonts w:ascii="Times New Roman" w:hAnsi="Times New Roman" w:eastAsia="SimSun" w:cs="Times New Roman"/>
       <w:kern w:val="0"/>
       <w:sz w:val="24"/>
       <w:szCs w:val="24"/>
@@ -2565,6 +2864,7 @@
   <w:style w:type="table" w:styleId="5">
     <w:name w:val="Table Grid"/>
     <w:basedOn w:val="3"/>
+    <w:qFormat/>
     <w:uiPriority w:val="0"/>
     <w:pPr>
       <w:widowControl w:val="0"/>

</xml_diff>